<commit_message>
docs(DA1): bản rút gọn cài đặt Telegram — 24 bước, không giải thích
DA1-11 dài 488 dòng vì phải nêu lý do từng quyết định, cách gỡ lỗi và phần
bảo mật. Người đang ngồi cài đặt không cần từng đó — họ cần biết bấm gì,
theo thứ tự nào.

DA1-12: 177 dòng, toàn bảng thao tác đánh số 1→24. Mỗi dòng một hành động,
không có đoạn văn giải thích nào. Kèm bảng lỗi thường gặp dạng "lỗi → sửa"
một dòng, và danh sách kiểm tra 14 mục.

Hai tài liệu cùng nội dung, khác mục đích: DA1-11 để hiểu và gỡ lỗi, DA1-12
để làm. DA1-12 dẫn chiếu sang DA1-11 ngay đầu tài liệu cho ai cần chi tiết.

Vẫn giữ ba cảnh báo không thể lược: tắt Group Privacy (bước 7), cấp quyền
admin cho bot (bước 12), bật Topics (bước 13). Ba mục này bỏ qua thì hệ thống
chạy nửa vời với triệu chứng đánh lừa, nên đánh dấu đậm trong bảng và nhắc
lại ở cuối danh sách kiểm tra.

README: DA1 lên 12 tài liệu, tổng 49 tài liệu / 15.376 dòng.

Co-Authored-By: Claude Opus 5 <noreply@anthropic.com>
</commit_message>
<xml_diff>
--- a/docs/README.docx
+++ b/docs/README.docx
@@ -2012,7 +2012,7 @@
                 <w:sz w:val="17"/>
                 <w:szCs w:val="17"/>
               </w:rPr>
-              <w:t xml:space="preserve">├── DA1-website-va-cms/                11 tài liệu · 4.006 dòng</w:t>
+              <w:t xml:space="preserve">├── DA1-website-va-cms/                12 tài liệu · 4.183 dòng</w:t>
             </w:r>
           </w:p>
           <w:p>
@@ -3254,7 +3254,91 @@
                 <w:sz w:val="20"/>
                 <w:szCs w:val="20"/>
               </w:rPr>
-              <w:t xml:space="preserve">Tạo bot Telegram, tạo nhóm cho nhân viên, cấu hình khung chat vào website, xử lý sự cố</w:t>
+              <w:t xml:space="preserve">Bản đầy đủ: tạo bot, tạo nhóm, cấu hình, giải thích lý do, xử lý sự cố, bảo mật</w:t>
+            </w:r>
+          </w:p>
+        </w:tc>
+        <w:tc>
+          <w:tcPr>
+            <w:tcW w:type="dxa" w:w="974"/>
+            <w:tcMar>
+              <w:top w:type="dxa" w:w="90"/>
+              <w:left w:type="dxa" w:w="120"/>
+              <w:bottom w:type="dxa" w:w="90"/>
+              <w:right w:type="dxa" w:w="120"/>
+            </w:tcMar>
+            <w:vAlign w:val="center"/>
+          </w:tcPr>
+          <w:p>
+            <w:pPr>
+              <w:spacing w:after="0" w:line="280"/>
+            </w:pPr>
+            <w:r>
+              <w:rPr>
+                <w:rFonts w:ascii="Be Vietnam Pro" w:cs="Be Vietnam Pro" w:eastAsia="Be Vietnam Pro" w:hAnsi="Be Vietnam Pro"/>
+                <w:color w:val="101814"/>
+                <w:sz w:val="20"/>
+                <w:szCs w:val="20"/>
+              </w:rPr>
+              <w:t xml:space="preserve">6</w:t>
+            </w:r>
+          </w:p>
+        </w:tc>
+      </w:tr>
+      <w:tr>
+        <w:trPr>
+          <w:tblHeader w:val="false"/>
+        </w:trPr>
+        <w:tc>
+          <w:tcPr>
+            <w:tcW w:type="dxa" w:w="4920"/>
+            <w:tcMar>
+              <w:top w:type="dxa" w:w="90"/>
+              <w:left w:type="dxa" w:w="120"/>
+              <w:bottom w:type="dxa" w:w="90"/>
+              <w:right w:type="dxa" w:w="120"/>
+            </w:tcMar>
+            <w:vAlign w:val="center"/>
+          </w:tcPr>
+          <w:p>
+            <w:pPr>
+              <w:spacing w:after="0" w:line="280"/>
+            </w:pPr>
+            <w:r>
+              <w:rPr>
+                <w:rFonts w:ascii="Menlo" w:cs="Menlo" w:eastAsia="Menlo" w:hAnsi="Menlo"/>
+                <w:color w:val="036F3D"/>
+                <w:sz w:val="20"/>
+                <w:szCs w:val="20"/>
+                <w:shd w:fill="F1F5F3" w:color="auto" w:val="clear"/>
+              </w:rPr>
+              <w:t xml:space="preserve">DA1-12-cai-dat-nhanh-telegram</w:t>
+            </w:r>
+          </w:p>
+        </w:tc>
+        <w:tc>
+          <w:tcPr>
+            <w:tcW w:type="dxa" w:w="3466"/>
+            <w:tcMar>
+              <w:top w:type="dxa" w:w="90"/>
+              <w:left w:type="dxa" w:w="120"/>
+              <w:bottom w:type="dxa" w:w="90"/>
+              <w:right w:type="dxa" w:w="120"/>
+            </w:tcMar>
+            <w:vAlign w:val="center"/>
+          </w:tcPr>
+          <w:p>
+            <w:pPr>
+              <w:spacing w:after="0" w:line="280"/>
+            </w:pPr>
+            <w:r>
+              <w:rPr>
+                <w:rFonts w:ascii="Be Vietnam Pro" w:cs="Be Vietnam Pro" w:eastAsia="Be Vietnam Pro" w:hAnsi="Be Vietnam Pro"/>
+                <w:color w:val="101814"/>
+                <w:sz w:val="20"/>
+                <w:szCs w:val="20"/>
+              </w:rPr>
+              <w:t xml:space="preserve">Bản rút gọn: 24 bước thao tác, không giải thích</w:t>
             </w:r>
           </w:p>
         </w:tc>
@@ -3302,7 +3386,340 @@
           <w:sz w:val="21"/>
           <w:szCs w:val="21"/>
         </w:rPr>
-        <w:t xml:space="preserve">Tách riêng vì đây là tài liệu </w:t>
+        <w:t xml:space="preserve">Hai tài liệu cùng nội dung, khác mục đích dùng:</w:t>
+      </w:r>
+    </w:p>
+    <w:tbl>
+      <w:tblPr>
+        <w:tblW w:type="dxa" w:w="9360"/>
+        <w:tblBorders>
+          <w:top w:val="single" w:color="CFE3D8" w:sz="4"/>
+          <w:left w:val="single" w:color="CFE3D8" w:sz="4"/>
+          <w:bottom w:val="single" w:color="CFE3D8" w:sz="4"/>
+          <w:right w:val="single" w:color="CFE3D8" w:sz="4"/>
+          <w:insideH w:val="single" w:color="CFE3D8" w:sz="4"/>
+          <w:insideV w:val="single" w:color="CFE3D8" w:sz="4"/>
+        </w:tblBorders>
+        <w:tblLayout w:type="fixed"/>
+      </w:tblPr>
+      <w:tblGrid>
+        <w:gridCol w:w="1026"/>
+        <w:gridCol w:w="4231"/>
+        <w:gridCol w:w="4103"/>
+      </w:tblGrid>
+      <w:tr>
+        <w:trPr>
+          <w:tblHeader/>
+        </w:trPr>
+        <w:tc>
+          <w:tcPr>
+            <w:tcW w:type="dxa" w:w="1026"/>
+            <w:shd w:fill="EEF6F1" w:color="auto" w:val="clear"/>
+            <w:tcMar>
+              <w:top w:type="dxa" w:w="90"/>
+              <w:left w:type="dxa" w:w="120"/>
+              <w:bottom w:type="dxa" w:w="90"/>
+              <w:right w:type="dxa" w:w="120"/>
+            </w:tcMar>
+            <w:vAlign w:val="center"/>
+          </w:tcPr>
+          <w:p>
+            <w:pPr>
+              <w:spacing w:after="0" w:line="280"/>
+            </w:pPr>
+            <w:r>
+              <w:rPr>
+                <w:rFonts w:ascii="Be Vietnam Pro" w:cs="Be Vietnam Pro" w:eastAsia="Be Vietnam Pro" w:hAnsi="Be Vietnam Pro"/>
+                <w:sz w:val="21"/>
+                <w:szCs w:val="21"/>
+              </w:rPr>
+              <w:t xml:space="preserve"/>
+            </w:r>
+          </w:p>
+        </w:tc>
+        <w:tc>
+          <w:tcPr>
+            <w:tcW w:type="dxa" w:w="4231"/>
+            <w:shd w:fill="EEF6F1" w:color="auto" w:val="clear"/>
+            <w:tcMar>
+              <w:top w:type="dxa" w:w="90"/>
+              <w:left w:type="dxa" w:w="120"/>
+              <w:bottom w:type="dxa" w:w="90"/>
+              <w:right w:type="dxa" w:w="120"/>
+            </w:tcMar>
+            <w:vAlign w:val="center"/>
+          </w:tcPr>
+          <w:p>
+            <w:pPr>
+              <w:spacing w:after="0" w:line="280"/>
+            </w:pPr>
+            <w:r>
+              <w:rPr>
+                <w:rFonts w:ascii="Menlo" w:cs="Menlo" w:eastAsia="Menlo" w:hAnsi="Menlo"/>
+                <w:b/>
+                <w:bCs/>
+                <w:color w:val="036F3D"/>
+                <w:sz w:val="20"/>
+                <w:szCs w:val="20"/>
+                <w:shd w:fill="F1F5F3" w:color="auto" w:val="clear"/>
+              </w:rPr>
+              <w:t xml:space="preserve">DA1-11</w:t>
+            </w:r>
+          </w:p>
+        </w:tc>
+        <w:tc>
+          <w:tcPr>
+            <w:tcW w:type="dxa" w:w="4103"/>
+            <w:shd w:fill="EEF6F1" w:color="auto" w:val="clear"/>
+            <w:tcMar>
+              <w:top w:type="dxa" w:w="90"/>
+              <w:left w:type="dxa" w:w="120"/>
+              <w:bottom w:type="dxa" w:w="90"/>
+              <w:right w:type="dxa" w:w="120"/>
+            </w:tcMar>
+            <w:vAlign w:val="center"/>
+          </w:tcPr>
+          <w:p>
+            <w:pPr>
+              <w:spacing w:after="0" w:line="280"/>
+            </w:pPr>
+            <w:r>
+              <w:rPr>
+                <w:rFonts w:ascii="Menlo" w:cs="Menlo" w:eastAsia="Menlo" w:hAnsi="Menlo"/>
+                <w:b/>
+                <w:bCs/>
+                <w:color w:val="036F3D"/>
+                <w:sz w:val="20"/>
+                <w:szCs w:val="20"/>
+                <w:shd w:fill="F1F5F3" w:color="auto" w:val="clear"/>
+              </w:rPr>
+              <w:t xml:space="preserve">DA1-12</w:t>
+            </w:r>
+          </w:p>
+        </w:tc>
+      </w:tr>
+      <w:tr>
+        <w:trPr>
+          <w:tblHeader w:val="false"/>
+        </w:trPr>
+        <w:tc>
+          <w:tcPr>
+            <w:tcW w:type="dxa" w:w="1026"/>
+            <w:tcMar>
+              <w:top w:type="dxa" w:w="90"/>
+              <w:left w:type="dxa" w:w="120"/>
+              <w:bottom w:type="dxa" w:w="90"/>
+              <w:right w:type="dxa" w:w="120"/>
+            </w:tcMar>
+            <w:vAlign w:val="center"/>
+          </w:tcPr>
+          <w:p>
+            <w:pPr>
+              <w:spacing w:after="0" w:line="280"/>
+            </w:pPr>
+            <w:r>
+              <w:rPr>
+                <w:rFonts w:ascii="Be Vietnam Pro" w:cs="Be Vietnam Pro" w:eastAsia="Be Vietnam Pro" w:hAnsi="Be Vietnam Pro"/>
+                <w:color w:val="101814"/>
+                <w:sz w:val="20"/>
+                <w:szCs w:val="20"/>
+              </w:rPr>
+              <w:t xml:space="preserve">Dùng khi</w:t>
+            </w:r>
+          </w:p>
+        </w:tc>
+        <w:tc>
+          <w:tcPr>
+            <w:tcW w:type="dxa" w:w="4231"/>
+            <w:tcMar>
+              <w:top w:type="dxa" w:w="90"/>
+              <w:left w:type="dxa" w:w="120"/>
+              <w:bottom w:type="dxa" w:w="90"/>
+              <w:right w:type="dxa" w:w="120"/>
+            </w:tcMar>
+            <w:vAlign w:val="center"/>
+          </w:tcPr>
+          <w:p>
+            <w:pPr>
+              <w:spacing w:after="0" w:line="280"/>
+            </w:pPr>
+            <w:r>
+              <w:rPr>
+                <w:rFonts w:ascii="Be Vietnam Pro" w:cs="Be Vietnam Pro" w:eastAsia="Be Vietnam Pro" w:hAnsi="Be Vietnam Pro"/>
+                <w:color w:val="101814"/>
+                <w:sz w:val="20"/>
+                <w:szCs w:val="20"/>
+              </w:rPr>
+              <w:t xml:space="preserve">Cần hiểu vì sao, hoặc đang gỡ lỗi</w:t>
+            </w:r>
+          </w:p>
+        </w:tc>
+        <w:tc>
+          <w:tcPr>
+            <w:tcW w:type="dxa" w:w="4103"/>
+            <w:tcMar>
+              <w:top w:type="dxa" w:w="90"/>
+              <w:left w:type="dxa" w:w="120"/>
+              <w:bottom w:type="dxa" w:w="90"/>
+              <w:right w:type="dxa" w:w="120"/>
+            </w:tcMar>
+            <w:vAlign w:val="center"/>
+          </w:tcPr>
+          <w:p>
+            <w:pPr>
+              <w:spacing w:after="0" w:line="280"/>
+            </w:pPr>
+            <w:r>
+              <w:rPr>
+                <w:rFonts w:ascii="Be Vietnam Pro" w:cs="Be Vietnam Pro" w:eastAsia="Be Vietnam Pro" w:hAnsi="Be Vietnam Pro"/>
+                <w:color w:val="101814"/>
+                <w:sz w:val="20"/>
+                <w:szCs w:val="20"/>
+              </w:rPr>
+              <w:t xml:space="preserve">Ngồi cài đặt, làm theo từng bước</w:t>
+            </w:r>
+          </w:p>
+        </w:tc>
+      </w:tr>
+      <w:tr>
+        <w:trPr>
+          <w:tblHeader w:val="false"/>
+        </w:trPr>
+        <w:tc>
+          <w:tcPr>
+            <w:tcW w:type="dxa" w:w="1026"/>
+            <w:tcMar>
+              <w:top w:type="dxa" w:w="90"/>
+              <w:left w:type="dxa" w:w="120"/>
+              <w:bottom w:type="dxa" w:w="90"/>
+              <w:right w:type="dxa" w:w="120"/>
+            </w:tcMar>
+            <w:vAlign w:val="center"/>
+          </w:tcPr>
+          <w:p>
+            <w:pPr>
+              <w:spacing w:after="0" w:line="280"/>
+            </w:pPr>
+            <w:r>
+              <w:rPr>
+                <w:rFonts w:ascii="Be Vietnam Pro" w:cs="Be Vietnam Pro" w:eastAsia="Be Vietnam Pro" w:hAnsi="Be Vietnam Pro"/>
+                <w:color w:val="101814"/>
+                <w:sz w:val="20"/>
+                <w:szCs w:val="20"/>
+              </w:rPr>
+              <w:t xml:space="preserve">Độ dài</w:t>
+            </w:r>
+          </w:p>
+        </w:tc>
+        <w:tc>
+          <w:tcPr>
+            <w:tcW w:type="dxa" w:w="4231"/>
+            <w:tcMar>
+              <w:top w:type="dxa" w:w="90"/>
+              <w:left w:type="dxa" w:w="120"/>
+              <w:bottom w:type="dxa" w:w="90"/>
+              <w:right w:type="dxa" w:w="120"/>
+            </w:tcMar>
+            <w:vAlign w:val="center"/>
+          </w:tcPr>
+          <w:p>
+            <w:pPr>
+              <w:spacing w:after="0" w:line="280"/>
+            </w:pPr>
+            <w:r>
+              <w:rPr>
+                <w:rFonts w:ascii="Be Vietnam Pro" w:cs="Be Vietnam Pro" w:eastAsia="Be Vietnam Pro" w:hAnsi="Be Vietnam Pro"/>
+                <w:color w:val="101814"/>
+                <w:sz w:val="20"/>
+                <w:szCs w:val="20"/>
+              </w:rPr>
+              <w:t xml:space="preserve">488 dòng</w:t>
+            </w:r>
+          </w:p>
+        </w:tc>
+        <w:tc>
+          <w:tcPr>
+            <w:tcW w:type="dxa" w:w="4103"/>
+            <w:tcMar>
+              <w:top w:type="dxa" w:w="90"/>
+              <w:left w:type="dxa" w:w="120"/>
+              <w:bottom w:type="dxa" w:w="90"/>
+              <w:right w:type="dxa" w:w="120"/>
+            </w:tcMar>
+            <w:vAlign w:val="center"/>
+          </w:tcPr>
+          <w:p>
+            <w:pPr>
+              <w:spacing w:after="0" w:line="280"/>
+            </w:pPr>
+            <w:r>
+              <w:rPr>
+                <w:rFonts w:ascii="Be Vietnam Pro" w:cs="Be Vietnam Pro" w:eastAsia="Be Vietnam Pro" w:hAnsi="Be Vietnam Pro"/>
+                <w:color w:val="101814"/>
+                <w:sz w:val="20"/>
+                <w:szCs w:val="20"/>
+              </w:rPr>
+              <w:t xml:space="preserve">177 dòng</w:t>
+            </w:r>
+          </w:p>
+        </w:tc>
+      </w:tr>
+    </w:tbl>
+    <w:p>
+      <w:pPr>
+        <w:spacing w:after="180"/>
+      </w:pPr>
+    </w:p>
+    <w:p>
+      <w:pPr>
+        <w:spacing w:after="130" w:line="300"/>
+      </w:pPr>
+      <w:r>
+        <w:rPr>
+          <w:rFonts w:ascii="Be Vietnam Pro" w:cs="Be Vietnam Pro" w:eastAsia="Be Vietnam Pro" w:hAnsi="Be Vietnam Pro"/>
+          <w:color w:val="101814"/>
+          <w:sz w:val="21"/>
+          <w:szCs w:val="21"/>
+        </w:rPr>
+        <w:t xml:space="preserve">Cả hai tách riêng khỏi </w:t>
+      </w:r>
+      <w:r>
+        <w:rPr>
+          <w:rFonts w:ascii="Menlo" w:cs="Menlo" w:eastAsia="Menlo" w:hAnsi="Menlo"/>
+          <w:color w:val="036F3D"/>
+          <w:sz w:val="19"/>
+          <w:szCs w:val="19"/>
+          <w:shd w:fill="F1F5F3" w:color="auto" w:val="clear"/>
+        </w:rPr>
+        <w:t xml:space="preserve">DA1-09</w:t>
+      </w:r>
+      <w:r>
+        <w:rPr>
+          <w:rFonts w:ascii="Be Vietnam Pro" w:cs="Be Vietnam Pro" w:eastAsia="Be Vietnam Pro" w:hAnsi="Be Vietnam Pro"/>
+          <w:color w:val="101814"/>
+          <w:sz w:val="21"/>
+          <w:szCs w:val="21"/>
+        </w:rPr>
+        <w:t xml:space="preserve"> vì </w:t>
+      </w:r>
+      <w:r>
+        <w:rPr>
+          <w:rFonts w:ascii="Menlo" w:cs="Menlo" w:eastAsia="Menlo" w:hAnsi="Menlo"/>
+          <w:color w:val="036F3D"/>
+          <w:sz w:val="19"/>
+          <w:szCs w:val="19"/>
+          <w:shd w:fill="F1F5F3" w:color="auto" w:val="clear"/>
+        </w:rPr>
+        <w:t xml:space="preserve">DA1-09</w:t>
+      </w:r>
+      <w:r>
+        <w:rPr>
+          <w:rFonts w:ascii="Be Vietnam Pro" w:cs="Be Vietnam Pro" w:eastAsia="Be Vietnam Pro" w:hAnsi="Be Vietnam Pro"/>
+          <w:color w:val="101814"/>
+          <w:sz w:val="21"/>
+          <w:szCs w:val="21"/>
+        </w:rPr>
+        <w:t xml:space="preserve"> hướng dẫn </w:t>
       </w:r>
       <w:r>
         <w:rPr>
@@ -3313,7 +3730,7 @@
           <w:sz w:val="21"/>
           <w:szCs w:val="21"/>
         </w:rPr>
-        <w:t xml:space="preserve">đưa cho người cài đặt làm theo từng bước</w:t>
+        <w:t xml:space="preserve">dùng hệ quản trị hằng ngày</w:t>
       </w:r>
       <w:r>
         <w:rPr>
@@ -3322,17 +3739,18 @@
           <w:sz w:val="21"/>
           <w:szCs w:val="21"/>
         </w:rPr>
-        <w:t xml:space="preserve">, khác mục đích với </w:t>
-      </w:r>
-      <w:r>
-        <w:rPr>
-          <w:rFonts w:ascii="Menlo" w:cs="Menlo" w:eastAsia="Menlo" w:hAnsi="Menlo"/>
-          <w:color w:val="036F3D"/>
-          <w:sz w:val="19"/>
-          <w:szCs w:val="19"/>
-          <w:shd w:fill="F1F5F3" w:color="auto" w:val="clear"/>
-        </w:rPr>
-        <w:t xml:space="preserve">DA1-09</w:t>
+        <w:t xml:space="preserve">, còn hai tài liệu này chỉ phục vụ </w:t>
+      </w:r>
+      <w:r>
+        <w:rPr>
+          <w:rFonts w:ascii="Be Vietnam Pro" w:cs="Be Vietnam Pro" w:eastAsia="Be Vietnam Pro" w:hAnsi="Be Vietnam Pro"/>
+          <w:b/>
+          <w:bCs/>
+          <w:color w:val="101814"/>
+          <w:sz w:val="21"/>
+          <w:szCs w:val="21"/>
+        </w:rPr>
+        <w:t xml:space="preserve">một lần cài đặt</w:t>
       </w:r>
       <w:r>
         <w:rPr>
@@ -3341,7 +3759,7 @@
           <w:sz w:val="21"/>
           <w:szCs w:val="21"/>
         </w:rPr>
-        <w:t xml:space="preserve"> vốn hướng dẫn dùng hệ quản trị hằng ngày.</w:t>
+        <w:t xml:space="preserve">.</w:t>
       </w:r>
     </w:p>
     <w:p>
@@ -3696,7 +4114,7 @@
                 <w:sz w:val="20"/>
                 <w:szCs w:val="20"/>
               </w:rPr>
-              <w:t xml:space="preserve">11</w:t>
+              <w:t xml:space="preserve">12</w:t>
             </w:r>
           </w:p>
         </w:tc>
@@ -3723,7 +4141,7 @@
                 <w:sz w:val="20"/>
                 <w:szCs w:val="20"/>
               </w:rPr>
-              <w:t xml:space="preserve">4.006</w:t>
+              <w:t xml:space="preserve">4.183</w:t>
             </w:r>
           </w:p>
         </w:tc>
@@ -4040,7 +4458,7 @@
                 <w:sz w:val="20"/>
                 <w:szCs w:val="20"/>
               </w:rPr>
-              <w:t xml:space="preserve">48</w:t>
+              <w:t xml:space="preserve">49</w:t>
             </w:r>
           </w:p>
         </w:tc>
@@ -4069,7 +4487,7 @@
                 <w:sz w:val="20"/>
                 <w:szCs w:val="20"/>
               </w:rPr>
-              <w:t xml:space="preserve">15.199</w:t>
+              <w:t xml:space="preserve">15.376</w:t>
             </w:r>
           </w:p>
         </w:tc>

</xml_diff>

<commit_message>
docs: đồng bộ số liệu README với thực tế 52 tài liệu / 16.770 dòng
Bảng quy mô và cây thư mục trong README ghi số dòng cũ, lệch so với thực tế
sau khi thêm 00-8, 00-9 và bốn phụ lục ma trận truy vết. Nay tính lại từ chính
các tệp .md nên không lệch được nữa.

Co-Authored-By: Claude Opus 5 <noreply@anthropic.com>
</commit_message>
<xml_diff>
--- a/docs/README.docx
+++ b/docs/README.docx
@@ -11624,7 +11624,7 @@
                 <w:sz w:val="20"/>
                 <w:szCs w:val="20"/>
               </w:rPr>
-              <w:t xml:space="preserve">2.320</w:t>
+              <w:t xml:space="preserve">2.342</w:t>
             </w:r>
           </w:p>
         </w:tc>
@@ -11709,7 +11709,7 @@
                 <w:sz w:val="20"/>
                 <w:szCs w:val="20"/>
               </w:rPr>
-              <w:t xml:space="preserve">4.186</w:t>
+              <w:t xml:space="preserve">4.297</w:t>
             </w:r>
           </w:p>
         </w:tc>
@@ -11794,7 +11794,7 @@
                 <w:sz w:val="20"/>
                 <w:szCs w:val="20"/>
               </w:rPr>
-              <w:t xml:space="preserve">3.157</w:t>
+              <w:t xml:space="preserve">3.258</w:t>
             </w:r>
           </w:p>
         </w:tc>
@@ -11879,7 +11879,7 @@
                 <w:sz w:val="20"/>
                 <w:szCs w:val="20"/>
               </w:rPr>
-              <w:t xml:space="preserve">3.758</w:t>
+              <w:t xml:space="preserve">3.883</w:t>
             </w:r>
           </w:p>
         </w:tc>
@@ -11975,7 +11975,7 @@
                 <w:sz w:val="20"/>
                 <w:szCs w:val="20"/>
               </w:rPr>
-              <w:t xml:space="preserve">2.716</w:t>
+              <w:t xml:space="preserve">2.731</w:t>
             </w:r>
           </w:p>
         </w:tc>

</xml_diff>